<commit_message>
docs: replace all 'Lable' occuranves with 'Label', add attributes and methods to class diagramm
</commit_message>
<xml_diff>
--- a/docs/docx/04.docx
+++ b/docs/docx/04.docx
@@ -105,7 +105,7 @@
         </w:numPr>
       </w:pPr>
       <w:r>
-        <w:t xml:space="preserve">Lable - используется для классификации и разбиении по группам Pull Request или Issue.</w:t>
+        <w:t xml:space="preserve">Label - используется для классификации и разбиении по группам Pull Request или Issue.</w:t>
       </w:r>
     </w:p>
     <w:p>
@@ -427,7 +427,7 @@
               <w:pStyle w:val="Compact"/>
             </w:pPr>
             <w:r>
-              <w:t xml:space="preserve">Lable</w:t>
+              <w:t xml:space="preserve">Label</w:t>
             </w:r>
           </w:p>
         </w:tc>
@@ -438,7 +438,7 @@
               <w:pStyle w:val="Compact"/>
             </w:pPr>
             <w:r>
-              <w:t xml:space="preserve">Lable Issue или Pull Request</w:t>
+              <w:t xml:space="preserve">Label Issue или Pull Request</w:t>
             </w:r>
           </w:p>
         </w:tc>
@@ -569,14 +569,14 @@
       <w:r>
         <w:drawing>
           <wp:inline>
-            <wp:extent cx="5676900" cy="5003800"/>
+            <wp:extent cx="5943600" cy="5860207"/>
             <wp:effectExtent b="0" l="0" r="0" t="0"/>
             <wp:docPr descr="" title="" id="49" name="Picture"/>
             <a:graphic>
               <a:graphicData uri="http://schemas.openxmlformats.org/drawingml/2006/picture">
                 <pic:pic>
                   <pic:nvPicPr>
-                    <pic:cNvPr descr="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" id="50" name="Picture"/>
+                    <pic:cNvPr descr="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" id="50" name="Picture"/>
                     <pic:cNvPicPr>
                       <a:picLocks noChangeArrowheads="1" noChangeAspect="1"/>
                     </pic:cNvPicPr>
@@ -590,7 +590,7 @@
                   <pic:spPr bwMode="auto">
                     <a:xfrm>
                       <a:off x="0" y="0"/>
-                      <a:ext cx="5676900" cy="5003800"/>
+                      <a:ext cx="5943600" cy="5860207"/>
                     </a:xfrm>
                     <a:prstGeom prst="rect">
                       <a:avLst/>

</xml_diff>